<commit_message>
Add Claude Certified Architect (Foundations) certification
</commit_message>
<xml_diff>
--- a/Aviral_Dubey_Resume_July.docx
+++ b/Aviral_Dubey_Resume_July.docx
@@ -137,7 +137,7 @@
           <w:szCs w:val="19"/>
           <w:rtl w:val="0"/>
         </w:rPr>
-        <w:t xml:space="preserve">AI Engineer with 1+ year of hands-on experience building AI-powered automation systems, integrating LLM APIs (Claude, OpenAI GPT-4), and designing intelligent backend workflows for SaaS platforms. At GrowwStacks — a Make.com Platinum Partner and Anthropic Services Partner — delivered production-grade agentic systems, prompt-engineered pipelines, and data extraction workflows across clients in 6+ countries. Anthropic Claude Certified and Make.com Certified Partner, with deep expertise in scalable AI pipeline design, cost optimization, and multi-agent orchestration.</w:t>
+        <w:t xml:space="preserve">AI Engineer with 1+ year of hands-on experience building AI-powered automation systems, integrating LLM APIs (Claude, OpenAI GPT-4), and designing intelligent backend workflows for SaaS platforms. At GrowwStacks — a Make.com Platinum Partner and Anthropic Services Partner — delivered production-grade agentic systems, prompt-engineered pipelines, and data extraction workflows across clients in 6+ countries. Claude Certified Architect (Foundations, Anthropic) and Make.com Certified Partner, with deep expertise in scalable AI pipeline design, cost optimization, and multi-agent orchestration.</w:t>
       </w:r>
       <w:r>
         <w:rPr>
@@ -303,7 +303,7 @@
           <w:szCs w:val="19"/>
           <w:rtl w:val="0"/>
         </w:rPr>
-        <w:t xml:space="preserve">Certifications:         Anthropic Claude Architect-Level Certification | Make.com Certified Partner</w:t>
+        <w:t xml:space="preserve">Certifications:         Claude Certified Architect — Foundations (Anthropic, 2026) | Make.com Certified Partner</w:t>
       </w:r>
       <w:r>
         <w:rPr>
@@ -1047,7 +1047,7 @@
           <w:vertAlign w:val="baseline"/>
           <w:rtl w:val="0"/>
         </w:rPr>
-        <w:t xml:space="preserve">Anthropic Claude Architect-Level Certification — Certified in advanced Claude API usage, agentic workflows, and enterprise AI integration</w:t>
+        <w:t xml:space="preserve">Claude Certified Architect — Foundations (Anthropic, Jun–Dec 2026) — Certified in advanced Claude API usage, agentic workflows, and enterprise AI integration | Verify: https://verify.skilljar.com/c/p2je67inhdoj</w:t>
       </w:r>
     </w:p>
     <w:p>

</xml_diff>